<commit_message>
Fix two-column extraction and remove template highlights
- Extract providers positionally (pdfplumber) so the paid amount is matched to
  the dollar figure on the SAME row as the provider name, not the 'Reduced from'
  amount below it. Fixes amounts being misassigned across providers and providers
  being dropped on two-column disbursements.
- Primary extraction now sends the PDF directly to Claude (native PDF layout)
  instead of linearized text, with a strengthened prompt about inline vs.
  reduced-from amounts.
- Detect client name from reading-order text (handles wrapped cause lines).
- Strip the 17 yellow highlights from the Word template so generated letters
  are clean.

https://claude.ai/code/session_01LaZZg2jgm7WA5MCL5Unvhc
</commit_message>
<xml_diff>
--- a/app/templates/payment_letter_template.docx
+++ b/app/templates/payment_letter_template.docx
@@ -473,7 +473,6 @@
           <w:noProof/>
           <w:sz w:val="24"/>
           <w:szCs w:val="24"/>
-          <w:highlight w:val="yellow"/>
         </w:rPr>
         <w:t/>
       </w:r>
@@ -536,7 +535,6 @@
           <w:noProof/>
           <w:sz w:val="24"/>
           <w:szCs w:val="24"/>
-          <w:highlight w:val="yellow"/>
         </w:rPr>
       </w:pPr>
       <w:r>
@@ -546,7 +544,6 @@
           <w:noProof/>
           <w:sz w:val="24"/>
           <w:szCs w:val="24"/>
-          <w:highlight w:val="yellow"/>
         </w:rPr>
         <w:t>{{ provider_name }}</w:t>
       </w:r>
@@ -561,7 +558,6 @@
           <w:noProof/>
           <w:sz w:val="24"/>
           <w:szCs w:val="24"/>
-          <w:highlight w:val="yellow"/>
         </w:rPr>
       </w:pPr>
       <w:r>
@@ -571,7 +567,6 @@
           <w:noProof/>
           <w:sz w:val="24"/>
           <w:szCs w:val="24"/>
-          <w:highlight w:val="yellow"/>
         </w:rPr>
         <w:t>{{ provider_address_line1 }}</w:t>
       </w:r>
@@ -595,7 +590,6 @@
           <w:noProof/>
           <w:sz w:val="24"/>
           <w:szCs w:val="24"/>
-          <w:highlight w:val="yellow"/>
         </w:rPr>
         <w:t>{{ provider_address_line2 }}</w:t>
       </w:r>
@@ -748,7 +742,6 @@
                 <w:rFonts w:ascii="Times New Roman" w:hAnsi="Times New Roman" w:cs="Times New Roman"/>
                 <w:sz w:val="24"/>
                 <w:szCs w:val="24"/>
-                <w:highlight w:val="yellow"/>
               </w:rPr>
             </w:pPr>
             <w:r>
@@ -757,7 +750,6 @@
                 <w:noProof/>
                 <w:sz w:val="24"/>
                 <w:szCs w:val="24"/>
-                <w:highlight w:val="yellow"/>
               </w:rPr>
               <w:t>{{ client_name }}</w:t>
             </w:r>
@@ -875,7 +867,6 @@
                 <w:rFonts w:ascii="Times New Roman" w:hAnsi="Times New Roman" w:cs="Times New Roman"/>
                 <w:sz w:val="24"/>
                 <w:szCs w:val="24"/>
-                <w:highlight w:val="yellow"/>
               </w:rPr>
             </w:pPr>
             <w:r>
@@ -883,7 +874,6 @@
                 <w:rFonts w:ascii="Times New Roman" w:hAnsi="Times New Roman" w:cs="Times New Roman"/>
                 <w:sz w:val="24"/>
                 <w:szCs w:val="24"/>
-                <w:highlight w:val="yellow"/>
               </w:rPr>
               <w:t>{{ account_number }}</w:t>
             </w:r>
@@ -1001,7 +991,6 @@
                 <w:rFonts w:ascii="Times New Roman" w:hAnsi="Times New Roman" w:cs="Times New Roman"/>
                 <w:sz w:val="24"/>
                 <w:szCs w:val="24"/>
-                <w:highlight w:val="yellow"/>
               </w:rPr>
             </w:pPr>
             <w:r>
@@ -1009,7 +998,6 @@
                 <w:rFonts w:ascii="Times New Roman" w:hAnsi="Times New Roman" w:cs="Times New Roman"/>
                 <w:sz w:val="24"/>
                 <w:szCs w:val="24"/>
-                <w:highlight w:val="yellow"/>
               </w:rPr>
               <w:t>{{ date_of_birth }}</w:t>
             </w:r>
@@ -1131,7 +1119,6 @@
                 <w:rFonts w:ascii="Times New Roman" w:hAnsi="Times New Roman" w:cs="Times New Roman"/>
                 <w:sz w:val="24"/>
                 <w:szCs w:val="24"/>
-                <w:highlight w:val="yellow"/>
               </w:rPr>
             </w:pPr>
             <w:r>
@@ -1140,7 +1127,6 @@
                 <w:noProof/>
                 <w:sz w:val="24"/>
                 <w:szCs w:val="24"/>
-                <w:highlight w:val="yellow"/>
               </w:rPr>
               <w:t>{{ date_of_loss }}</w:t>
             </w:r>
@@ -1334,7 +1320,6 @@
           <w:color w:val="000000" w:themeColor="text1"/>
           <w:sz w:val="24"/>
           <w:szCs w:val="24"/>
-          <w:highlight w:val="yellow"/>
         </w:rPr>
         <w:t>{{ check_number }}</w:t>
       </w:r>
@@ -1345,7 +1330,6 @@
           <w:color w:val="000000" w:themeColor="text1"/>
           <w:sz w:val="24"/>
           <w:szCs w:val="24"/>
-          <w:highlight w:val="yellow"/>
         </w:rPr>
         <w:t/>
       </w:r>
@@ -1373,7 +1357,6 @@
           <w:color w:val="000000" w:themeColor="text1"/>
           <w:sz w:val="24"/>
           <w:szCs w:val="24"/>
-          <w:highlight w:val="yellow"/>
         </w:rPr>
         <w:t>{{ payment_amount }}</w:t>
       </w:r>

</xml_diff>